<commit_message>
Commit versão final do projeto
</commit_message>
<xml_diff>
--- a/Arquivos/AutoPark System - Software Engineer_v5.docx
+++ b/Arquivos/AutoPark System - Software Engineer_v5.docx
@@ -13,6 +13,7 @@
           <w:szCs w:val="60"/>
         </w:rPr>
       </w:pPr>
+      <w:proofErr w:type="spellStart"/>
       <w:r>
         <w:rPr>
           <w:rFonts w:ascii="Arial" w:hAnsi="Arial" w:cs="Arial"/>
@@ -21,12 +22,10 @@
           <w:sz w:val="60"/>
           <w:szCs w:val="60"/>
         </w:rPr>
-        <w:t>AutoPark System</w:t>
-      </w:r>
-    </w:p>
-    <w:p>
-      <w:pPr>
-        <w:jc w:val="center"/>
+        <w:t>AutoPark</w:t>
+      </w:r>
+      <w:proofErr w:type="spellEnd"/>
+      <w:r>
         <w:rPr>
           <w:rFonts w:ascii="Arial" w:hAnsi="Arial" w:cs="Arial"/>
           <w:b/>
@@ -34,7 +33,8 @@
           <w:sz w:val="60"/>
           <w:szCs w:val="60"/>
         </w:rPr>
-      </w:pPr>
+        <w:t xml:space="preserve"> System</w:t>
+      </w:r>
     </w:p>
     <w:p>
       <w:pPr>
@@ -59,7 +59,10 @@
           <w:szCs w:val="60"/>
         </w:rPr>
       </w:pPr>
-      <w:r>
+    </w:p>
+    <w:p>
+      <w:pPr>
+        <w:jc w:val="center"/>
         <w:rPr>
           <w:rFonts w:ascii="Arial" w:hAnsi="Arial" w:cs="Arial"/>
           <w:b/>
@@ -67,12 +70,8 @@
           <w:sz w:val="60"/>
           <w:szCs w:val="60"/>
         </w:rPr>
-        <w:t>Software Engineer</w:t>
-      </w:r>
-    </w:p>
-    <w:p>
-      <w:pPr>
-        <w:jc w:val="center"/>
+      </w:pPr>
+      <w:r>
         <w:rPr>
           <w:rFonts w:ascii="Arial" w:hAnsi="Arial" w:cs="Arial"/>
           <w:b/>
@@ -80,11 +79,10 @@
           <w:sz w:val="60"/>
           <w:szCs w:val="60"/>
         </w:rPr>
-      </w:pPr>
-    </w:p>
-    <w:p>
-      <w:pPr>
-        <w:jc w:val="center"/>
+        <w:t xml:space="preserve">Software </w:t>
+      </w:r>
+      <w:proofErr w:type="spellStart"/>
+      <w:r>
         <w:rPr>
           <w:rFonts w:ascii="Arial" w:hAnsi="Arial" w:cs="Arial"/>
           <w:b/>
@@ -92,7 +90,9 @@
           <w:sz w:val="60"/>
           <w:szCs w:val="60"/>
         </w:rPr>
-      </w:pPr>
+        <w:t>Engineer</w:t>
+      </w:r>
+      <w:proofErr w:type="spellEnd"/>
     </w:p>
     <w:p>
       <w:pPr>
@@ -117,7 +117,10 @@
           <w:szCs w:val="60"/>
         </w:rPr>
       </w:pPr>
-      <w:r>
+    </w:p>
+    <w:p>
+      <w:pPr>
+        <w:jc w:val="center"/>
         <w:rPr>
           <w:rFonts w:ascii="Arial" w:hAnsi="Arial" w:cs="Arial"/>
           <w:b/>
@@ -125,8 +128,7 @@
           <w:sz w:val="60"/>
           <w:szCs w:val="60"/>
         </w:rPr>
-        <w:t xml:space="preserve">Faculdade Impacta </w:t>
-      </w:r>
+      </w:pPr>
     </w:p>
     <w:p>
       <w:pPr>
@@ -139,10 +141,7 @@
           <w:szCs w:val="60"/>
         </w:rPr>
       </w:pPr>
-    </w:p>
-    <w:p>
-      <w:pPr>
-        <w:jc w:val="center"/>
+      <w:r>
         <w:rPr>
           <w:rFonts w:ascii="Arial" w:hAnsi="Arial" w:cs="Arial"/>
           <w:b/>
@@ -150,6 +149,31 @@
           <w:sz w:val="60"/>
           <w:szCs w:val="60"/>
         </w:rPr>
+        <w:t xml:space="preserve">Faculdade Impacta </w:t>
+      </w:r>
+    </w:p>
+    <w:p>
+      <w:pPr>
+        <w:jc w:val="center"/>
+        <w:rPr>
+          <w:rFonts w:ascii="Arial" w:hAnsi="Arial" w:cs="Arial"/>
+          <w:b/>
+          <w:bCs/>
+          <w:sz w:val="60"/>
+          <w:szCs w:val="60"/>
+        </w:rPr>
+      </w:pPr>
+    </w:p>
+    <w:p>
+      <w:pPr>
+        <w:jc w:val="center"/>
+        <w:rPr>
+          <w:rFonts w:ascii="Arial" w:hAnsi="Arial" w:cs="Arial"/>
+          <w:b/>
+          <w:bCs/>
+          <w:sz w:val="60"/>
+          <w:szCs w:val="60"/>
+        </w:rPr>
       </w:pPr>
     </w:p>
     <w:p>
@@ -483,7 +507,25 @@
           <w:sz w:val="20"/>
           <w:szCs w:val="20"/>
         </w:rPr>
-        <w:t>Após a integração do AutoPark System, o estacionamento contará com cancelas eletrônicas atreladas a câmeras que farão o registro da placa do veículo, o horário de entrada e a saída será condicionada ao pagamento, de acordo com o tempo de permanência que será calculado automaticamente.</w:t>
+        <w:t xml:space="preserve">Após a integração do </w:t>
+      </w:r>
+      <w:proofErr w:type="spellStart"/>
+      <w:r>
+        <w:rPr>
+          <w:rFonts w:ascii="Arial" w:hAnsi="Arial" w:cs="Arial"/>
+          <w:sz w:val="20"/>
+          <w:szCs w:val="20"/>
+        </w:rPr>
+        <w:t>AutoPark</w:t>
+      </w:r>
+      <w:proofErr w:type="spellEnd"/>
+      <w:r>
+        <w:rPr>
+          <w:rFonts w:ascii="Arial" w:hAnsi="Arial" w:cs="Arial"/>
+          <w:sz w:val="20"/>
+          <w:szCs w:val="20"/>
+        </w:rPr>
+        <w:t xml:space="preserve"> System, o estacionamento contará com cancelas eletrônicas atreladas a câmeras que farão o registro da placa do veículo, o horário de entrada e a saída será condicionada ao pagamento, de acordo com o tempo de permanência que será calculado automaticamente.</w:t>
       </w:r>
     </w:p>
     <w:p>
@@ -898,7 +940,25 @@
           <w:sz w:val="20"/>
           <w:szCs w:val="20"/>
         </w:rPr>
-        <w:t>Repositório Git organizado</w:t>
+        <w:t xml:space="preserve">Repositório </w:t>
+      </w:r>
+      <w:proofErr w:type="spellStart"/>
+      <w:r>
+        <w:rPr>
+          <w:rFonts w:ascii="Arial" w:hAnsi="Arial" w:cs="Arial"/>
+          <w:sz w:val="20"/>
+          <w:szCs w:val="20"/>
+        </w:rPr>
+        <w:t>Git</w:t>
+      </w:r>
+      <w:proofErr w:type="spellEnd"/>
+      <w:r>
+        <w:rPr>
+          <w:rFonts w:ascii="Arial" w:hAnsi="Arial" w:cs="Arial"/>
+          <w:sz w:val="20"/>
+          <w:szCs w:val="20"/>
+        </w:rPr>
+        <w:t xml:space="preserve"> organizado</w:t>
       </w:r>
     </w:p>
     <w:p>
@@ -1394,7 +1454,25 @@
           <w:sz w:val="20"/>
           <w:szCs w:val="20"/>
         </w:rPr>
-        <w:t>O AutoPark System é um sistema desenvolvido para automatizar a gestão de estacionamentos, permitindo o controle de entrada e saída de veículos, monitoramento de vagas em tempo real, automatização do processo de pagamento e funcionários / colaboradores.</w:t>
+        <w:t xml:space="preserve">O </w:t>
+      </w:r>
+      <w:proofErr w:type="spellStart"/>
+      <w:r>
+        <w:rPr>
+          <w:rFonts w:ascii="Arial" w:hAnsi="Arial" w:cs="Arial"/>
+          <w:sz w:val="20"/>
+          <w:szCs w:val="20"/>
+        </w:rPr>
+        <w:t>AutoPark</w:t>
+      </w:r>
+      <w:proofErr w:type="spellEnd"/>
+      <w:r>
+        <w:rPr>
+          <w:rFonts w:ascii="Arial" w:hAnsi="Arial" w:cs="Arial"/>
+          <w:sz w:val="20"/>
+          <w:szCs w:val="20"/>
+        </w:rPr>
+        <w:t xml:space="preserve"> System é um sistema desenvolvido para automatizar a gestão de estacionamentos, permitindo o controle de entrada e saída de veículos, monitoramento de vagas em tempo real, automatização do processo de pagamento e funcionários / colaboradores.</w:t>
       </w:r>
     </w:p>
     <w:p>
@@ -2363,8 +2441,19 @@
           <w:sz w:val="24"/>
           <w:szCs w:val="24"/>
         </w:rPr>
-        <w:t>8. Stakholders</w:t>
-      </w:r>
+        <w:t xml:space="preserve">8. </w:t>
+      </w:r>
+      <w:proofErr w:type="spellStart"/>
+      <w:r>
+        <w:rPr>
+          <w:rStyle w:val="Forte"/>
+          <w:rFonts w:ascii="Arial" w:hAnsi="Arial" w:cs="Arial"/>
+          <w:sz w:val="24"/>
+          <w:szCs w:val="24"/>
+        </w:rPr>
+        <w:t>Stakholders</w:t>
+      </w:r>
+      <w:proofErr w:type="spellEnd"/>
     </w:p>
     <w:tbl>
       <w:tblPr>
@@ -3840,8 +3929,39 @@
           <w:sz w:val="24"/>
           <w:szCs w:val="24"/>
         </w:rPr>
-        <w:t>Business Process Managment</w:t>
-      </w:r>
+        <w:t xml:space="preserve">Business </w:t>
+      </w:r>
+      <w:proofErr w:type="spellStart"/>
+      <w:r>
+        <w:rPr>
+          <w:rStyle w:val="Forte"/>
+          <w:rFonts w:ascii="Arial" w:hAnsi="Arial" w:cs="Arial"/>
+          <w:sz w:val="24"/>
+          <w:szCs w:val="24"/>
+        </w:rPr>
+        <w:t>Process</w:t>
+      </w:r>
+      <w:proofErr w:type="spellEnd"/>
+      <w:r>
+        <w:rPr>
+          <w:rStyle w:val="Forte"/>
+          <w:rFonts w:ascii="Arial" w:hAnsi="Arial" w:cs="Arial"/>
+          <w:sz w:val="24"/>
+          <w:szCs w:val="24"/>
+        </w:rPr>
+        <w:t xml:space="preserve"> </w:t>
+      </w:r>
+      <w:proofErr w:type="spellStart"/>
+      <w:r>
+        <w:rPr>
+          <w:rStyle w:val="Forte"/>
+          <w:rFonts w:ascii="Arial" w:hAnsi="Arial" w:cs="Arial"/>
+          <w:sz w:val="24"/>
+          <w:szCs w:val="24"/>
+        </w:rPr>
+        <w:t>Managment</w:t>
+      </w:r>
+      <w:proofErr w:type="spellEnd"/>
     </w:p>
     <w:p>
       <w:pPr>
@@ -3922,6 +4042,7 @@
         </w:rPr>
         <w:t xml:space="preserve">. </w:t>
       </w:r>
+      <w:proofErr w:type="spellStart"/>
       <w:r>
         <w:rPr>
           <w:rStyle w:val="Forte"/>
@@ -3931,6 +4052,7 @@
         </w:rPr>
         <w:t>Storyboard</w:t>
       </w:r>
+      <w:proofErr w:type="spellEnd"/>
     </w:p>
     <w:p>
       <w:r>
@@ -4345,7 +4467,7 @@
           <w:noProof/>
         </w:rPr>
         <w:drawing>
-          <wp:inline distT="0" distB="0" distL="0" distR="0" wp14:anchorId="6B149395" wp14:editId="4E47FF27">
+          <wp:inline distT="0" distB="0" distL="0" distR="0" wp14:anchorId="6B149395" wp14:editId="592E30AD">
             <wp:extent cx="5400040" cy="4276725"/>
             <wp:effectExtent l="0" t="0" r="0" b="9525"/>
             <wp:docPr id="1050915226" name="Imagem 1"/>
@@ -4387,6 +4509,19 @@
         </w:drawing>
       </w:r>
     </w:p>
+    <w:p/>
+    <w:p/>
+    <w:p/>
+    <w:p/>
+    <w:p/>
+    <w:p/>
+    <w:p/>
+    <w:p/>
+    <w:p/>
+    <w:p/>
+    <w:p/>
+    <w:p/>
+    <w:p/>
     <w:p>
       <w:pPr>
         <w:pStyle w:val="Ttulo1"/>
@@ -4397,15 +4532,17 @@
           <w:szCs w:val="24"/>
         </w:rPr>
       </w:pPr>
-      <w:r>
+    </w:p>
+    <w:p>
+      <w:pPr>
+        <w:pStyle w:val="Ttulo1"/>
         <w:rPr>
           <w:rStyle w:val="Forte"/>
           <w:rFonts w:ascii="Arial" w:hAnsi="Arial" w:cs="Arial"/>
           <w:sz w:val="24"/>
           <w:szCs w:val="24"/>
         </w:rPr>
-        <w:t>14</w:t>
-      </w:r>
+      </w:pPr>
       <w:r>
         <w:rPr>
           <w:rStyle w:val="Forte"/>
@@ -4413,7 +4550,7 @@
           <w:sz w:val="24"/>
           <w:szCs w:val="24"/>
         </w:rPr>
-        <w:t xml:space="preserve">. </w:t>
+        <w:t>14</w:t>
       </w:r>
       <w:r>
         <w:rPr>
@@ -4422,6 +4559,15 @@
           <w:sz w:val="24"/>
           <w:szCs w:val="24"/>
         </w:rPr>
+        <w:t xml:space="preserve">. </w:t>
+      </w:r>
+      <w:r>
+        <w:rPr>
+          <w:rStyle w:val="Forte"/>
+          <w:rFonts w:ascii="Arial" w:hAnsi="Arial" w:cs="Arial"/>
+          <w:sz w:val="24"/>
+          <w:szCs w:val="24"/>
+        </w:rPr>
         <w:t>Protótipo</w:t>
       </w:r>
     </w:p>
@@ -4432,14 +4578,11 @@
     </w:p>
     <w:p>
       <w:r>
-        <w:rPr>
-          <w:noProof/>
-        </w:rPr>
         <w:drawing>
-          <wp:inline distT="0" distB="0" distL="0" distR="0" wp14:anchorId="1BB8C5B9" wp14:editId="3A702DF2">
-            <wp:extent cx="2637790" cy="4132052"/>
-            <wp:effectExtent l="0" t="0" r="0" b="1905"/>
-            <wp:docPr id="419261594" name="Imagem 1"/>
+          <wp:inline distT="0" distB="0" distL="0" distR="0" wp14:anchorId="1DC662EC" wp14:editId="46CAE655">
+            <wp:extent cx="2275078" cy="4211053"/>
+            <wp:effectExtent l="0" t="0" r="0" b="0"/>
+            <wp:docPr id="1923723789" name="Imagem 1"/>
             <wp:cNvGraphicFramePr>
               <a:graphicFrameLocks xmlns:a="http://schemas.openxmlformats.org/drawingml/2006/main" noChangeAspect="1"/>
             </wp:cNvGraphicFramePr>
@@ -4447,7 +4590,7 @@
               <a:graphicData uri="http://schemas.openxmlformats.org/drawingml/2006/picture">
                 <pic:pic xmlns:pic="http://schemas.openxmlformats.org/drawingml/2006/picture">
                   <pic:nvPicPr>
-                    <pic:cNvPr id="419261594" name=""/>
+                    <pic:cNvPr id="1923723789" name=""/>
                     <pic:cNvPicPr/>
                   </pic:nvPicPr>
                   <pic:blipFill>
@@ -4459,7 +4602,7 @@
                   <pic:spPr>
                     <a:xfrm>
                       <a:off x="0" y="0"/>
-                      <a:ext cx="2652252" cy="4154707"/>
+                      <a:ext cx="2283694" cy="4227001"/>
                     </a:xfrm>
                     <a:prstGeom prst="rect">
                       <a:avLst/>
@@ -4474,20 +4617,16 @@
     </w:p>
     <w:p>
       <w:r>
-        <w:lastRenderedPageBreak/>
         <w:t>Tela de Login</w:t>
       </w:r>
     </w:p>
     <w:p>
       <w:r>
-        <w:rPr>
-          <w:noProof/>
-        </w:rPr>
         <w:drawing>
-          <wp:inline distT="0" distB="0" distL="0" distR="0" wp14:anchorId="1DC45AD1" wp14:editId="7D460CF2">
-            <wp:extent cx="2675890" cy="4148919"/>
-            <wp:effectExtent l="0" t="0" r="0" b="4445"/>
-            <wp:docPr id="1391695249" name="Imagem 1"/>
+          <wp:inline distT="0" distB="0" distL="0" distR="0" wp14:anchorId="5AE62BA1" wp14:editId="724BC1D1">
+            <wp:extent cx="2305013" cy="3753853"/>
+            <wp:effectExtent l="0" t="0" r="635" b="0"/>
+            <wp:docPr id="1628050733" name="Imagem 1"/>
             <wp:cNvGraphicFramePr>
               <a:graphicFrameLocks xmlns:a="http://schemas.openxmlformats.org/drawingml/2006/main" noChangeAspect="1"/>
             </wp:cNvGraphicFramePr>
@@ -4495,7 +4634,7 @@
               <a:graphicData uri="http://schemas.openxmlformats.org/drawingml/2006/picture">
                 <pic:pic xmlns:pic="http://schemas.openxmlformats.org/drawingml/2006/picture">
                   <pic:nvPicPr>
-                    <pic:cNvPr id="1391695249" name=""/>
+                    <pic:cNvPr id="1628050733" name=""/>
                     <pic:cNvPicPr/>
                   </pic:nvPicPr>
                   <pic:blipFill>
@@ -4507,7 +4646,7 @@
                   <pic:spPr>
                     <a:xfrm>
                       <a:off x="0" y="0"/>
-                      <a:ext cx="2700666" cy="4187334"/>
+                      <a:ext cx="2307639" cy="3758129"/>
                     </a:xfrm>
                     <a:prstGeom prst="rect">
                       <a:avLst/>
@@ -4520,22 +4659,19 @@
         </w:drawing>
       </w:r>
     </w:p>
-    <w:p/>
-    <w:p>
-      <w:r>
+    <w:p>
+      <w:r>
+        <w:lastRenderedPageBreak/>
         <w:t>Tela Home</w:t>
       </w:r>
     </w:p>
     <w:p>
       <w:r>
-        <w:rPr>
-          <w:noProof/>
-        </w:rPr>
         <w:drawing>
-          <wp:inline distT="0" distB="0" distL="0" distR="0" wp14:anchorId="4E632713" wp14:editId="0FAFB5FB">
-            <wp:extent cx="2657475" cy="4189862"/>
-            <wp:effectExtent l="0" t="0" r="0" b="1270"/>
-            <wp:docPr id="173275582" name="Imagem 1"/>
+          <wp:inline distT="0" distB="0" distL="0" distR="0" wp14:anchorId="3BC25F30" wp14:editId="73043616">
+            <wp:extent cx="2286000" cy="4355432"/>
+            <wp:effectExtent l="0" t="0" r="0" b="7620"/>
+            <wp:docPr id="25036235" name="Imagem 1"/>
             <wp:cNvGraphicFramePr>
               <a:graphicFrameLocks xmlns:a="http://schemas.openxmlformats.org/drawingml/2006/main" noChangeAspect="1"/>
             </wp:cNvGraphicFramePr>
@@ -4543,7 +4679,7 @@
               <a:graphicData uri="http://schemas.openxmlformats.org/drawingml/2006/picture">
                 <pic:pic xmlns:pic="http://schemas.openxmlformats.org/drawingml/2006/picture">
                   <pic:nvPicPr>
-                    <pic:cNvPr id="173275582" name=""/>
+                    <pic:cNvPr id="25036235" name=""/>
                     <pic:cNvPicPr/>
                   </pic:nvPicPr>
                   <pic:blipFill>
@@ -4555,7 +4691,7 @@
                   <pic:spPr>
                     <a:xfrm>
                       <a:off x="0" y="0"/>
-                      <a:ext cx="2661162" cy="4195675"/>
+                      <a:ext cx="2287056" cy="4357443"/>
                     </a:xfrm>
                     <a:prstGeom prst="rect">
                       <a:avLst/>
@@ -4570,20 +4706,16 @@
     </w:p>
     <w:p>
       <w:r>
-        <w:lastRenderedPageBreak/>
         <w:t>Tela de Veículos</w:t>
       </w:r>
     </w:p>
     <w:p>
       <w:r>
-        <w:rPr>
-          <w:noProof/>
-        </w:rPr>
         <w:drawing>
-          <wp:inline distT="0" distB="0" distL="0" distR="0" wp14:anchorId="4262A0F7" wp14:editId="7BE6CCC8">
-            <wp:extent cx="2656205" cy="4217159"/>
+          <wp:inline distT="0" distB="0" distL="0" distR="0" wp14:anchorId="2EE5E14A" wp14:editId="39101F77">
+            <wp:extent cx="2294815" cy="4307305"/>
             <wp:effectExtent l="0" t="0" r="0" b="0"/>
-            <wp:docPr id="1674045792" name="Imagem 1"/>
+            <wp:docPr id="2142737799" name="Imagem 1"/>
             <wp:cNvGraphicFramePr>
               <a:graphicFrameLocks xmlns:a="http://schemas.openxmlformats.org/drawingml/2006/main" noChangeAspect="1"/>
             </wp:cNvGraphicFramePr>
@@ -4591,7 +4723,7 @@
               <a:graphicData uri="http://schemas.openxmlformats.org/drawingml/2006/picture">
                 <pic:pic xmlns:pic="http://schemas.openxmlformats.org/drawingml/2006/picture">
                   <pic:nvPicPr>
-                    <pic:cNvPr id="1674045792" name=""/>
+                    <pic:cNvPr id="2142737799" name=""/>
                     <pic:cNvPicPr/>
                   </pic:nvPicPr>
                   <pic:blipFill>
@@ -4603,7 +4735,7 @@
                   <pic:spPr>
                     <a:xfrm>
                       <a:off x="0" y="0"/>
-                      <a:ext cx="2686857" cy="4265823"/>
+                      <a:ext cx="2302639" cy="4321990"/>
                     </a:xfrm>
                     <a:prstGeom prst="rect">
                       <a:avLst/>
@@ -4618,19 +4750,17 @@
     </w:p>
     <w:p>
       <w:r>
+        <w:lastRenderedPageBreak/>
         <w:t>Tela de Informações Sobre Veículo</w:t>
       </w:r>
     </w:p>
     <w:p>
       <w:r>
-        <w:rPr>
-          <w:noProof/>
-        </w:rPr>
         <w:drawing>
-          <wp:inline distT="0" distB="0" distL="0" distR="0" wp14:anchorId="6DEE2AD3" wp14:editId="55536D10">
-            <wp:extent cx="2676296" cy="4135272"/>
-            <wp:effectExtent l="0" t="0" r="0" b="0"/>
-            <wp:docPr id="709556429" name="Imagem 1"/>
+          <wp:inline distT="0" distB="0" distL="0" distR="0" wp14:anchorId="497FAB15" wp14:editId="2C3EC99A">
+            <wp:extent cx="2285818" cy="3922295"/>
+            <wp:effectExtent l="0" t="0" r="635" b="2540"/>
+            <wp:docPr id="541176949" name="Imagem 1"/>
             <wp:cNvGraphicFramePr>
               <a:graphicFrameLocks xmlns:a="http://schemas.openxmlformats.org/drawingml/2006/main" noChangeAspect="1"/>
             </wp:cNvGraphicFramePr>
@@ -4638,7 +4768,7 @@
               <a:graphicData uri="http://schemas.openxmlformats.org/drawingml/2006/picture">
                 <pic:pic xmlns:pic="http://schemas.openxmlformats.org/drawingml/2006/picture">
                   <pic:nvPicPr>
-                    <pic:cNvPr id="709556429" name=""/>
+                    <pic:cNvPr id="541176949" name=""/>
                     <pic:cNvPicPr/>
                   </pic:nvPicPr>
                   <pic:blipFill>
@@ -4650,7 +4780,7 @@
                   <pic:spPr>
                     <a:xfrm>
                       <a:off x="0" y="0"/>
-                      <a:ext cx="2701383" cy="4174035"/>
+                      <a:ext cx="2288846" cy="3927490"/>
                     </a:xfrm>
                     <a:prstGeom prst="rect">
                       <a:avLst/>
@@ -4666,20 +4796,16 @@
     <w:p/>
     <w:p>
       <w:r>
-        <w:lastRenderedPageBreak/>
         <w:t>Tela de Suporte</w:t>
       </w:r>
     </w:p>
     <w:p>
       <w:r>
-        <w:rPr>
-          <w:noProof/>
-        </w:rPr>
         <w:drawing>
-          <wp:inline distT="0" distB="0" distL="0" distR="0" wp14:anchorId="45CD693E" wp14:editId="063B0351">
-            <wp:extent cx="2676525" cy="4435522"/>
-            <wp:effectExtent l="0" t="0" r="0" b="3175"/>
-            <wp:docPr id="1736212020" name="Imagem 1"/>
+          <wp:inline distT="0" distB="0" distL="0" distR="0" wp14:anchorId="1C6E8F29" wp14:editId="5BD9CA79">
+            <wp:extent cx="2304415" cy="4451684"/>
+            <wp:effectExtent l="0" t="0" r="635" b="6350"/>
+            <wp:docPr id="478631286" name="Imagem 1"/>
             <wp:cNvGraphicFramePr>
               <a:graphicFrameLocks xmlns:a="http://schemas.openxmlformats.org/drawingml/2006/main" noChangeAspect="1"/>
             </wp:cNvGraphicFramePr>
@@ -4687,7 +4813,7 @@
               <a:graphicData uri="http://schemas.openxmlformats.org/drawingml/2006/picture">
                 <pic:pic xmlns:pic="http://schemas.openxmlformats.org/drawingml/2006/picture">
                   <pic:nvPicPr>
-                    <pic:cNvPr id="1736212020" name=""/>
+                    <pic:cNvPr id="478631286" name=""/>
                     <pic:cNvPicPr/>
                   </pic:nvPicPr>
                   <pic:blipFill>
@@ -4699,7 +4825,7 @@
                   <pic:spPr>
                     <a:xfrm>
                       <a:off x="0" y="0"/>
-                      <a:ext cx="2679667" cy="4440729"/>
+                      <a:ext cx="2311520" cy="4465409"/>
                     </a:xfrm>
                     <a:prstGeom prst="rect">
                       <a:avLst/>
@@ -4714,19 +4840,17 @@
     </w:p>
     <w:p>
       <w:r>
+        <w:lastRenderedPageBreak/>
         <w:t>Tela de Pagamento</w:t>
       </w:r>
     </w:p>
     <w:p>
       <w:r>
-        <w:rPr>
-          <w:noProof/>
-        </w:rPr>
         <w:drawing>
-          <wp:inline distT="0" distB="0" distL="0" distR="0" wp14:anchorId="3A3AC782" wp14:editId="5850878B">
-            <wp:extent cx="2676484" cy="4304582"/>
-            <wp:effectExtent l="0" t="0" r="0" b="1270"/>
-            <wp:docPr id="956297316" name="Imagem 1"/>
+          <wp:inline distT="0" distB="0" distL="0" distR="0" wp14:anchorId="1D09E016" wp14:editId="1EE671AE">
+            <wp:extent cx="2295845" cy="4782217"/>
+            <wp:effectExtent l="0" t="0" r="9525" b="0"/>
+            <wp:docPr id="529287917" name="Imagem 1"/>
             <wp:cNvGraphicFramePr>
               <a:graphicFrameLocks xmlns:a="http://schemas.openxmlformats.org/drawingml/2006/main" noChangeAspect="1"/>
             </wp:cNvGraphicFramePr>
@@ -4734,7 +4858,7 @@
               <a:graphicData uri="http://schemas.openxmlformats.org/drawingml/2006/picture">
                 <pic:pic xmlns:pic="http://schemas.openxmlformats.org/drawingml/2006/picture">
                   <pic:nvPicPr>
-                    <pic:cNvPr id="956297316" name=""/>
+                    <pic:cNvPr id="529287917" name=""/>
                     <pic:cNvPicPr/>
                   </pic:nvPicPr>
                   <pic:blipFill>
@@ -4746,7 +4870,7 @@
                   <pic:spPr>
                     <a:xfrm>
                       <a:off x="0" y="0"/>
-                      <a:ext cx="2681928" cy="4313338"/>
+                      <a:ext cx="2295845" cy="4782217"/>
                     </a:xfrm>
                     <a:prstGeom prst="rect">
                       <a:avLst/>
@@ -4759,9 +4883,6 @@
         </w:drawing>
       </w:r>
     </w:p>
-    <w:p/>
-    <w:p/>
-    <w:p/>
     <w:sectPr>
       <w:pgSz w:w="11906" w:h="16838"/>
       <w:pgMar w:top="567" w:right="1701" w:bottom="1276" w:left="1701" w:header="708" w:footer="708" w:gutter="0"/>

</xml_diff>